<commit_message>
refactor: update title to Generative AI & Full-Stack Developer across portfolio and resume
- portfolio.ts: hero title updated
- Hero.tsx: badge text updated to GENERATIVE AI • FULL-STACK
- resume/page.tsx: header title updated
- DOCX regenerated with updated title
</commit_message>
<xml_diff>
--- a/Portfolio/public/resume-mahar-sarfaraz.docx
+++ b/Portfolio/public/resume-mahar-sarfaraz.docx
@@ -31,7 +31,7 @@
           <w:sz w:val="22"/>
           <w:szCs w:val="22"/>
         </w:rPr>
-        <w:t xml:space="preserve">Agentic AI Developer &amp; Full-Stack Engineer</w:t>
+        <w:t xml:space="preserve">Generative AI &amp; Full-Stack Developer</w:t>
       </w:r>
     </w:p>
     <w:p>
@@ -54,7 +54,7 @@
         <w:spacing w:after="200"/>
         <w:jc w:val="center"/>
       </w:pPr>
-      <w:hyperlink w:history="1" r:id="rIdzheehyub1nhxxhunp-ysz">
+      <w:hyperlink w:history="1" r:id="rIdoe1xvvm5shxdtcbch6yhy">
         <w:r>
           <w:rPr>
             <w:rFonts w:ascii="Calibri" w:cs="Calibri" w:eastAsia="Calibri" w:hAnsi="Calibri"/>
@@ -75,7 +75,7 @@
         </w:rPr>
         <w:t xml:space="preserve">  |  </w:t>
       </w:r>
-      <w:hyperlink w:history="1" r:id="rId5fiic5jkzuk5x1egk2ep3">
+      <w:hyperlink w:history="1" r:id="rIdvjsr1cmbqk7_e_ybiawi9">
         <w:r>
           <w:rPr>
             <w:rFonts w:ascii="Calibri" w:cs="Calibri" w:eastAsia="Calibri" w:hAnsi="Calibri"/>
@@ -96,7 +96,7 @@
         </w:rPr>
         <w:t xml:space="preserve">  |  </w:t>
       </w:r>
-      <w:hyperlink w:history="1" r:id="rIddtoaxe9joomr1kb3slhrs">
+      <w:hyperlink w:history="1" r:id="rIdnomjuwbworgronvmpbl3i">
         <w:r>
           <w:rPr>
             <w:rFonts w:ascii="Calibri" w:cs="Calibri" w:eastAsia="Calibri" w:hAnsi="Calibri"/>

</xml_diff>